<commit_message>
Docs: set response-time targets for NFR-01
NFR-01 required "agreed response-time targets" without stating any, so it
could not be marked passed or failed. Define them in the SRS:

- 95th percentile under normal load (up to 50 concurrent users)
- page loads and search/filter within 2 seconds
- quiz submission with objective scoring and result display within 3 seconds
- LLM-backed operations excluded
</commit_message>
<xml_diff>
--- a/Documents/SRS Document.docx
+++ b/Documents/SRS Document.docx
@@ -3639,7 +3639,7 @@
                 <w:sz w:val="17"/>
                 <w:szCs w:val="17"/>
               </w:rPr>
-              <w:t xml:space="preserve">The system should respond to normal user operations within an acceptable time, with fast quiz submission and result generation, and efficient search and filtering.</w:t>
+              <w:t xml:space="preserve">The system should respond to normal user operations within the following targets, measured at the 95th percentile under normal load (up to 50 concurrent users): page loads and search/filter within 2 seconds, and quiz submission with objective-question scoring and result display within 3 seconds. Operations that depend on the external LLM service (question generation, descriptive-answer evaluation, Ask AI) are excluded from these targets.</w:t>
             </w:r>
           </w:p>
         </w:tc>
@@ -3703,21 +3703,21 @@
                 <w:sz w:val="17"/>
                 <w:szCs w:val="17"/>
               </w:rPr>
-              <w:t xml:space="preserve">Pass: Common operations (page loads, quiz submission, search/filter) complete within the agreed response-time targets under normal load.</w:t>
-            </w:r>
-          </w:p>
-          <w:p>
-            <w:pPr>
-              <w:spacing w:after="40"/>
-            </w:pPr>
-            <w:r>
-              <w:rPr>
-                <w:b w:val="false"/>
-                <w:bCs w:val="false"/>
-                <w:sz w:val="17"/>
-                <w:szCs w:val="17"/>
-              </w:rPr>
-              <w:t xml:space="preserve">Fail: Any of these operations regularly exceeds the target response time under normal load.</w:t>
+              <w:t xml:space="preserve">Pass: Under normal load (up to 50 concurrent users), the 95th-percentile response time is at most 2 seconds for page loads and for search/filter, and at most 3 seconds for quiz submission with result display.</w:t>
+            </w:r>
+          </w:p>
+          <w:p>
+            <w:pPr>
+              <w:spacing w:after="40"/>
+            </w:pPr>
+            <w:r>
+              <w:rPr>
+                <w:b w:val="false"/>
+                <w:bCs w:val="false"/>
+                <w:sz w:val="17"/>
+                <w:szCs w:val="17"/>
+              </w:rPr>
+              <w:t xml:space="preserve">Fail: Any of these 95th-percentile times exceeds its target under normal load.</w:t>
             </w:r>
           </w:p>
         </w:tc>

</xml_diff>